<commit_message>
Make Halverson Ridge a high school with 26 sections
Students move to grades 9-12 and twelve more sections come from the upper school
course of study, filling departments the first fourteen missed. The original
fourteen sections' generated data is unchanged. Agent prompts, the grade filter
and tests follow the new school.
</commit_message>
<xml_diff>
--- a/backend/samples/talia-barnard-teacher-note.docx
+++ b/backend/samples/talia-barnard-teacher-note.docx
@@ -7,12 +7,12 @@
         <w:pStyle w:val="Heading1"/>
       </w:pPr>
       <w:r>
-        <w:t>Teacher note — Talia Barnard (S-1507), Grade 7</w:t>
+        <w:t>Teacher note — Talia Barnard (S-1507), Grade 11</w:t>
       </w:r>
     </w:p>
     <w:p>
       <w:r>
-        <w:t>FICTIONAL SAMPLE DOCUMENT. Halverson Ridge Middle School, Fall 2026, week 5. Written by S. Frankel (Algebra Foundations) with input from L. Moreau (Digital Photography).</w:t>
+        <w:t>FICTIONAL SAMPLE DOCUMENT. Halverson Ridge High School, Fall 2026, week 5. Written by S. Frankel (Algebra Foundations) with input from L. Moreau (Digital Photography).</w:t>
       </w:r>
     </w:p>
     <w:p>

</xml_diff>